<commit_message>
feat: adiciona QR codes cruzados e reorganiza cabecalho do curriculo
- Portfolio: card com QR (tema dourado) ao lado do botao Baixar Curriculo -> aponta para o .docx
- Curriculo: QR no cabecalho -> aponta para o portfolio (ryandua11.github.io)
- Curriculo: cabecalho reorganizado, GitHub e Portfolio agora rotulados e separados (remove aparencia de link duplicado); Portfolio em destaque junto ao QR

Co-Authored-By: Claude Opus 4.8 <noreply@anthropic.com>
</commit_message>
<xml_diff>
--- a/Ryan_Duarte_Quintao_ATS.docx
+++ b/Ryan_Duarte_Quintao_ATS.docx
@@ -46,7 +46,16 @@
           <w:i w:val="0"/>
           <w:sz w:val="19"/>
         </w:rPr>
-        <w:t xml:space="preserve">(27) 99202-9310  |  </w:t>
+        <w:t xml:space="preserve">(27) 99202-9310</w:t>
+      </w:r>
+      <w:r>
+        <w:rPr>
+          <w:rFonts w:ascii="Calibri" w:hAnsi="Calibri"/>
+          <w:b w:val="0"/>
+          <w:i w:val="0"/>
+          <w:sz w:val="19"/>
+        </w:rPr>
+        <w:t xml:space="preserve"> · </w:t>
       </w:r>
       <w:hyperlink r:id="rId14" w:history="1">
         <w:r>
@@ -57,7 +66,7 @@
             <w:color w:val="1A3A6B"/>
             <w:sz w:val="19"/>
           </w:rPr>
-          <w:t>ryanduarteq.04@gmail.com</w:t>
+          <w:t xml:space="preserve">ryanduarteq.04@gmail.com</w:t>
         </w:r>
       </w:hyperlink>
       <w:r>
@@ -67,7 +76,23 @@
           <w:i w:val="0"/>
           <w:sz w:val="19"/>
         </w:rPr>
-        <w:t xml:space="preserve">  |  </w:t>
+        <w:t xml:space="preserve"> · Serra/ES</w:t>
+      </w:r>
+    </w:p>
+    <w:p>
+      <w:pPr>
+        <w:jc w:val="center"/>
+        <w:spacing w:before="0" w:after="40"/>
+      </w:pPr>
+      <w:r>
+        <w:rPr>
+          <w:rFonts w:ascii="Calibri" w:hAnsi="Calibri"/>
+          <w:b/>
+          <w:i w:val="0"/>
+          <w:color w:val="505050"/>
+          <w:sz w:val="19"/>
+        </w:rPr>
+        <w:t xml:space="preserve">LinkedIn:  </w:t>
       </w:r>
       <w:hyperlink r:id="rId15" w:history="1">
         <w:r>
@@ -78,7 +103,7 @@
             <w:color w:val="1A3A6B"/>
             <w:sz w:val="19"/>
           </w:rPr>
-          <w:t>linkedin.com/in/ryan-duarte-39028a2a1</w:t>
+          <w:t xml:space="preserve">linkedin.com/in/ryan-duarte-39028a2a1</w:t>
         </w:r>
       </w:hyperlink>
       <w:r>
@@ -88,7 +113,17 @@
           <w:i w:val="0"/>
           <w:sz w:val="19"/>
         </w:rPr>
-        <w:t xml:space="preserve">  |  </w:t>
+        <w:t xml:space="preserve">  ·  </w:t>
+      </w:r>
+      <w:r>
+        <w:rPr>
+          <w:rFonts w:ascii="Calibri" w:hAnsi="Calibri"/>
+          <w:b/>
+          <w:i w:val="0"/>
+          <w:color w:val="505050"/>
+          <w:sz w:val="19"/>
+        </w:rPr>
+        <w:t xml:space="preserve">GitHub:  </w:t>
       </w:r>
       <w:hyperlink r:id="rId16" w:history="1">
         <w:r>
@@ -99,39 +134,83 @@
             <w:color w:val="1A3A6B"/>
             <w:sz w:val="19"/>
           </w:rPr>
-          <w:t>github.com/RyanDua11</w:t>
+          <w:t xml:space="preserve">github.com/RyanDua11</w:t>
         </w:r>
       </w:hyperlink>
+    </w:p>
+    <w:p>
+      <w:pPr>
+        <w:jc w:val="center"/>
+        <w:spacing w:before="40" w:after="10"/>
+      </w:pPr>
+      <w:r>
+        <w:rPr>
+          <w:noProof/>
+        </w:rPr>
+        <w:drawing>
+          <wp:inline distT="0" distB="0" distL="0" distR="0">
+            <wp:extent cx="522000" cy="522000"/>
+            <wp:effectExtent l="0" t="0" r="0" b="0"/>
+            <wp:docPr id="900" name="QR Portfolio" descr="QR code do portfolio ryandua11.github.io"/>
+            <wp:cNvGraphicFramePr>
+              <a:graphicFrameLocks xmlns:a="http://schemas.openxmlformats.org/drawingml/2006/main" noChangeAspect="1"/>
+            </wp:cNvGraphicFramePr>
+            <a:graphic xmlns:a="http://schemas.openxmlformats.org/drawingml/2006/main">
+              <a:graphicData uri="http://schemas.openxmlformats.org/drawingml/2006/picture">
+                <pic:pic xmlns:pic="http://schemas.openxmlformats.org/drawingml/2006/picture">
+                  <pic:nvPicPr>
+                    <pic:cNvPr id="900" name="QR Portfolio" descr="QR code do portfolio"/>
+                    <pic:cNvPicPr/>
+                  </pic:nvPicPr>
+                  <pic:blipFill>
+                    <a:blip r:embed="rId18"/>
+                    <a:stretch>
+                      <a:fillRect/>
+                    </a:stretch>
+                  </pic:blipFill>
+                  <pic:spPr>
+                    <a:xfrm>
+                      <a:off x="0" y="0"/>
+                      <a:ext cx="522000" cy="522000"/>
+                    </a:xfrm>
+                    <a:prstGeom prst="rect">
+                      <a:avLst/>
+                    </a:prstGeom>
+                  </pic:spPr>
+                </pic:pic>
+              </a:graphicData>
+            </a:graphic>
+          </wp:inline>
+        </w:drawing>
+      </w:r>
+    </w:p>
+    <w:p>
+      <w:pPr>
+        <w:jc w:val="center"/>
+        <w:spacing w:before="0" w:after="60"/>
+      </w:pPr>
       <w:r>
         <w:rPr>
           <w:rFonts w:ascii="Calibri" w:hAnsi="Calibri"/>
-          <w:b w:val="0"/>
+          <w:b/>
           <w:i w:val="0"/>
-          <w:sz w:val="19"/>
+          <w:color w:val="505050"/>
+          <w:sz w:val="21"/>
         </w:rPr>
-        <w:t xml:space="preserve">  |  </w:t>
+        <w:t xml:space="preserve">Portfólio </w:t>
       </w:r>
       <w:hyperlink r:id="rId17" w:history="1">
         <w:r>
           <w:rPr>
             <w:rFonts w:ascii="Calibri" w:hAnsi="Calibri"/>
-            <w:b w:val="0"/>
+            <w:b/>
             <w:i w:val="0"/>
             <w:color w:val="1A3A6B"/>
-            <w:sz w:val="19"/>
+            <w:sz w:val="21"/>
           </w:rPr>
-          <w:t>ryandua11.github.io</w:t>
+          <w:t xml:space="preserve">ryandua11.github.io</w:t>
         </w:r>
       </w:hyperlink>
-      <w:r>
-        <w:rPr>
-          <w:rFonts w:ascii="Calibri" w:hAnsi="Calibri"/>
-          <w:b w:val="0"/>
-          <w:i w:val="0"/>
-          <w:sz w:val="19"/>
-        </w:rPr>
-        <w:t xml:space="preserve">  |  Serra – ES</w:t>
-      </w:r>
     </w:p>
     <w:p>
       <w:pPr>

</xml_diff>